<commit_message>
Updated and merged with nnew design
</commit_message>
<xml_diff>
--- a/career/Krish_Lalani_Resume.docx
+++ b/career/Krish_Lalani_Resume.docx
@@ -11,7 +11,7 @@
           <w:rFonts w:ascii="Arial" w:hAnsi="Arial"/>
           <w:b/>
           <w:color w:val="172B40"/>
-          <w:sz w:val="56"/>
+          <w:sz w:val="48"/>
         </w:rPr>
         <w:t>Krish Lalani</w:t>
       </w:r>
@@ -25,7 +25,7 @@
           <w:rFonts w:ascii="Arial" w:hAnsi="Arial"/>
           <w:b/>
           <w:color w:val="24647B"/>
-          <w:sz w:val="19"/>
+          <w:sz w:val="18"/>
         </w:rPr>
         <w:t>SOFTWARE DEVELOPER  |  PYTHON, BACKEND &amp; COMPUTER VISION</w:t>
       </w:r>
@@ -39,7 +39,7 @@
           <w:rFonts w:ascii="Arial" w:hAnsi="Arial"/>
           <w:b w:val="0"/>
           <w:color w:val="596878"/>
-          <w:sz w:val="18"/>
+          <w:sz w:val="17"/>
         </w:rPr>
         <w:t xml:space="preserve">Gujarat, India  |  </w:t>
       </w:r>
@@ -49,7 +49,7 @@
             <w:rFonts w:ascii="Arial" w:hAnsi="Arial"/>
             <w:b w:val="0"/>
             <w:color w:val="596878"/>
-            <w:sz w:val="18"/>
+            <w:sz w:val="17"/>
             <w:u w:val="none"/>
           </w:rPr>
           <w:t>Krish7lalani@gmail.com</w:t>
@@ -60,7 +60,7 @@
           <w:rFonts w:ascii="Arial" w:hAnsi="Arial"/>
           <w:b w:val="0"/>
           <w:color w:val="596878"/>
-          <w:sz w:val="18"/>
+          <w:sz w:val="17"/>
         </w:rPr>
         <w:t xml:space="preserve">  |  +91 90548 71719</w:t>
       </w:r>
@@ -75,7 +75,7 @@
             <w:rFonts w:ascii="Arial" w:hAnsi="Arial"/>
             <w:b w:val="0"/>
             <w:color w:val="596878"/>
-            <w:sz w:val="18"/>
+            <w:sz w:val="17"/>
             <w:u w:val="none"/>
           </w:rPr>
           <w:t>portfolio.krishlalani.dev</w:t>
@@ -86,7 +86,7 @@
           <w:rFonts w:ascii="Arial" w:hAnsi="Arial"/>
           <w:b w:val="0"/>
           <w:color w:val="596878"/>
-          <w:sz w:val="18"/>
+          <w:sz w:val="17"/>
         </w:rPr>
         <w:t xml:space="preserve">  |  </w:t>
       </w:r>
@@ -96,7 +96,7 @@
             <w:rFonts w:ascii="Arial" w:hAnsi="Arial"/>
             <w:b w:val="0"/>
             <w:color w:val="596878"/>
-            <w:sz w:val="18"/>
+            <w:sz w:val="17"/>
             <w:u w:val="none"/>
           </w:rPr>
           <w:t>github.com/KrishLalani</w:t>
@@ -113,7 +113,7 @@
             <w:rFonts w:ascii="Arial" w:hAnsi="Arial"/>
             <w:b w:val="0"/>
             <w:color w:val="596878"/>
-            <w:sz w:val="18"/>
+            <w:sz w:val="17"/>
             <w:u w:val="none"/>
           </w:rPr>
           <w:t>www.linkedin.com/in/krish-lalani-bb4385252</w:t>
@@ -129,7 +129,7 @@
           <w:rFonts w:ascii="Arial" w:hAnsi="Arial"/>
           <w:b/>
           <w:color w:val="172B40"/>
-          <w:sz w:val="19"/>
+          <w:sz w:val="18"/>
         </w:rPr>
         <w:t>PROFESSIONAL SUMMARY</w:t>
       </w:r>
@@ -141,9 +141,9 @@
           <w:rFonts w:ascii="Arial" w:hAnsi="Arial"/>
           <w:b w:val="0"/>
           <w:color w:val="172B40"/>
-          <w:sz w:val="20"/>
+          <w:sz w:val="18"/>
         </w:rPr>
-        <w:t>Software developer focused on Python backends and computer vision, with experience in industrial inspection, REST API architecture, and backend team leadership.</w:t>
+        <w:t>Software developer specializing in Python backends and computer vision. Builds and deploys YOLO and OpenCV detection pipelines for industrial inspection, and designs REST APIs, database schemas, and access controls for platforms with real users. Led a four-engineer backend team on a platform that supported a live examination with 100+ students.</w:t>
       </w:r>
     </w:p>
     <w:p>
@@ -155,7 +155,7 @@
           <w:rFonts w:ascii="Arial" w:hAnsi="Arial"/>
           <w:b/>
           <w:color w:val="172B40"/>
-          <w:sz w:val="19"/>
+          <w:sz w:val="18"/>
         </w:rPr>
         <w:t>TECHNICAL SKILLS</w:t>
       </w:r>
@@ -202,7 +202,50 @@
                 <w:rFonts w:ascii="Arial" w:hAnsi="Arial"/>
                 <w:b/>
                 <w:color w:val="172B40"/>
-                <w:sz w:val="19"/>
+                <w:sz w:val="17"/>
+              </w:rPr>
+              <w:t>Core competencies:</w:t>
+            </w:r>
+          </w:p>
+        </w:tc>
+        <w:tc>
+          <w:tcPr>
+            <w:tcW w:type="dxa" w:w="8454"/>
+            <w:vAlign w:val="center"/>
+          </w:tcPr>
+          <w:p>
+            <w:pPr>
+              <w:pStyle w:val="SkillRow"/>
+            </w:pPr>
+            <w:r>
+              <w:rPr>
+                <w:rFonts w:ascii="Arial" w:hAnsi="Arial"/>
+                <w:b w:val="0"/>
+                <w:color w:val="172B40"/>
+                <w:sz w:val="17"/>
+              </w:rPr>
+              <w:t>Backend Development, REST API Design, Computer Vision, Object Detection, Model Deployment, Database Design, Technical Leadership</w:t>
+            </w:r>
+          </w:p>
+        </w:tc>
+      </w:tr>
+      <w:tr>
+        <w:tc>
+          <w:tcPr>
+            <w:tcW w:type="dxa" w:w="2000"/>
+            <w:vAlign w:val="center"/>
+            <w:shd w:fill="EDF3F7"/>
+          </w:tcPr>
+          <w:p>
+            <w:pPr>
+              <w:pStyle w:val="SkillRow"/>
+            </w:pPr>
+            <w:r>
+              <w:rPr>
+                <w:rFonts w:ascii="Arial" w:hAnsi="Arial"/>
+                <w:b/>
+                <w:color w:val="172B40"/>
+                <w:sz w:val="17"/>
               </w:rPr>
               <w:t>Languages &amp; backend:</w:t>
             </w:r>
@@ -222,7 +265,7 @@
                 <w:rFonts w:ascii="Arial" w:hAnsi="Arial"/>
                 <w:b w:val="0"/>
                 <w:color w:val="172B40"/>
-                <w:sz w:val="19"/>
+                <w:sz w:val="17"/>
               </w:rPr>
               <w:t>Python, JavaScript, SQL, Flask, FastAPI, Django, Node.js, Express, REST APIs, JWT</w:t>
             </w:r>
@@ -245,7 +288,7 @@
                 <w:rFonts w:ascii="Arial" w:hAnsi="Arial"/>
                 <w:b/>
                 <w:color w:val="172B40"/>
-                <w:sz w:val="19"/>
+                <w:sz w:val="17"/>
               </w:rPr>
               <w:t>Vision &amp; data:</w:t>
             </w:r>
@@ -265,7 +308,7 @@
                 <w:rFonts w:ascii="Arial" w:hAnsi="Arial"/>
                 <w:b w:val="0"/>
                 <w:color w:val="172B40"/>
-                <w:sz w:val="19"/>
+                <w:sz w:val="17"/>
               </w:rPr>
               <w:t>YOLO, OpenCV, PyTorch, PostgreSQL, MySQL, SQLite, MongoDB, Supabase</w:t>
             </w:r>
@@ -288,7 +331,7 @@
                 <w:rFonts w:ascii="Arial" w:hAnsi="Arial"/>
                 <w:b/>
                 <w:color w:val="172B40"/>
-                <w:sz w:val="19"/>
+                <w:sz w:val="17"/>
               </w:rPr>
               <w:t>Tools:</w:t>
             </w:r>
@@ -308,7 +351,7 @@
                 <w:rFonts w:ascii="Arial" w:hAnsi="Arial"/>
                 <w:b w:val="0"/>
                 <w:color w:val="172B40"/>
-                <w:sz w:val="19"/>
+                <w:sz w:val="17"/>
               </w:rPr>
               <w:t>Git, Docker, Linux, Azure DevOps, CI/CD, Postman, Beautiful Soup, Selenium</w:t>
             </w:r>
@@ -325,7 +368,7 @@
           <w:rFonts w:ascii="Arial" w:hAnsi="Arial"/>
           <w:b/>
           <w:color w:val="172B40"/>
-          <w:sz w:val="19"/>
+          <w:sz w:val="18"/>
         </w:rPr>
         <w:t>PROFESSIONAL EXPERIENCE</w:t>
       </w:r>
@@ -339,7 +382,7 @@
           <w:rFonts w:ascii="Arial" w:hAnsi="Arial"/>
           <w:b/>
           <w:color w:val="172B40"/>
-          <w:sz w:val="20"/>
+          <w:sz w:val="19"/>
         </w:rPr>
         <w:t>Software Developer</w:t>
       </w:r>
@@ -348,7 +391,7 @@
           <w:rFonts w:ascii="Arial" w:hAnsi="Arial"/>
           <w:b w:val="0"/>
           <w:color w:val="172B40"/>
-          <w:sz w:val="20"/>
+          <w:sz w:val="19"/>
         </w:rPr>
         <w:t xml:space="preserve"> | Microble Technologies  </w:t>
       </w:r>
@@ -357,7 +400,7 @@
           <w:rFonts w:ascii="Arial" w:hAnsi="Arial"/>
           <w:b w:val="0"/>
           <w:color w:val="596878"/>
-          <w:sz w:val="20"/>
+          <w:sz w:val="19"/>
         </w:rPr>
         <w:tab/>
         <w:t>Apr 2026–Present</w:t>
@@ -376,9 +419,45 @@
           <w:rFonts w:ascii="Arial" w:hAnsi="Arial"/>
           <w:b w:val="0"/>
           <w:color w:val="172B40"/>
-          <w:sz w:val="20"/>
+          <w:sz w:val="18"/>
         </w:rPr>
-        <w:t>Develop industrial inspection pipelines for insulator defect detection with YOLO and OpenCV; own dataset preparation, annotation, augmentation, model training, evaluation, and deployment.</w:t>
+        <w:t>Develop machine-vision systems for industrial inspection, including insulator defect detection.</w:t>
+      </w:r>
+    </w:p>
+    <w:p>
+      <w:pPr>
+        <w:pStyle w:val="ListBullet"/>
+        <w:numPr>
+          <w:ilvl w:val="0"/>
+          <w:numId w:val="10"/>
+        </w:numPr>
+      </w:pPr>
+      <w:r>
+        <w:rPr>
+          <w:rFonts w:ascii="Arial" w:hAnsi="Arial"/>
+          <w:b w:val="0"/>
+          <w:color w:val="172B40"/>
+          <w:sz w:val="18"/>
+        </w:rPr>
+        <w:t>Own training data end to end: image collection, annotation, and augmentation for YOLO models.</w:t>
+      </w:r>
+    </w:p>
+    <w:p>
+      <w:pPr>
+        <w:pStyle w:val="ListBullet"/>
+        <w:numPr>
+          <w:ilvl w:val="0"/>
+          <w:numId w:val="10"/>
+        </w:numPr>
+      </w:pPr>
+      <w:r>
+        <w:rPr>
+          <w:rFonts w:ascii="Arial" w:hAnsi="Arial"/>
+          <w:b w:val="0"/>
+          <w:color w:val="172B40"/>
+          <w:sz w:val="18"/>
+        </w:rPr>
+        <w:t>Train, evaluate, and deploy vision models into production inspection workflows using OpenCV.</w:t>
       </w:r>
     </w:p>
     <w:p>
@@ -390,7 +469,7 @@
           <w:rFonts w:ascii="Arial" w:hAnsi="Arial"/>
           <w:b/>
           <w:color w:val="172B40"/>
-          <w:sz w:val="20"/>
+          <w:sz w:val="19"/>
         </w:rPr>
         <w:t>Python Developer</w:t>
       </w:r>
@@ -399,7 +478,7 @@
           <w:rFonts w:ascii="Arial" w:hAnsi="Arial"/>
           <w:b w:val="0"/>
           <w:color w:val="172B40"/>
-          <w:sz w:val="20"/>
+          <w:sz w:val="19"/>
         </w:rPr>
         <w:t xml:space="preserve"> | Empire Circuits LLC  </w:t>
       </w:r>
@@ -408,7 +487,7 @@
           <w:rFonts w:ascii="Arial" w:hAnsi="Arial"/>
           <w:b w:val="0"/>
           <w:color w:val="596878"/>
-          <w:sz w:val="20"/>
+          <w:sz w:val="19"/>
         </w:rPr>
         <w:tab/>
         <w:t>Sep 2025–Apr 2026</w:t>
@@ -427,9 +506,45 @@
           <w:rFonts w:ascii="Arial" w:hAnsi="Arial"/>
           <w:b w:val="0"/>
           <w:color w:val="172B40"/>
-          <w:sz w:val="20"/>
+          <w:sz w:val="18"/>
         </w:rPr>
-        <w:t>Built PondGuard’s detection and response software, an OpenCV PCB image-stitching pipeline, and ThingsBoard/Grafana monitoring dashboards backed by MQTT.</w:t>
+        <w:t>Built PondGuard’s bird-detection software with event capture and automated deterrent responses.</w:t>
+      </w:r>
+    </w:p>
+    <w:p>
+      <w:pPr>
+        <w:pStyle w:val="ListBullet"/>
+        <w:numPr>
+          <w:ilvl w:val="0"/>
+          <w:numId w:val="10"/>
+        </w:numPr>
+      </w:pPr>
+      <w:r>
+        <w:rPr>
+          <w:rFonts w:ascii="Arial" w:hAnsi="Arial"/>
+          <w:b w:val="0"/>
+          <w:color w:val="172B40"/>
+          <w:sz w:val="18"/>
+        </w:rPr>
+        <w:t>Built an OpenCV image-stitching pipeline for PCB quality inspection.</w:t>
+      </w:r>
+    </w:p>
+    <w:p>
+      <w:pPr>
+        <w:pStyle w:val="ListBullet"/>
+        <w:numPr>
+          <w:ilvl w:val="0"/>
+          <w:numId w:val="10"/>
+        </w:numPr>
+      </w:pPr>
+      <w:r>
+        <w:rPr>
+          <w:rFonts w:ascii="Arial" w:hAnsi="Arial"/>
+          <w:b w:val="0"/>
+          <w:color w:val="172B40"/>
+          <w:sz w:val="18"/>
+        </w:rPr>
+        <w:t>Built real-time monitoring dashboards with ThingsBoard, Grafana, and MQTT.</w:t>
       </w:r>
     </w:p>
     <w:p>
@@ -441,7 +556,7 @@
           <w:rFonts w:ascii="Arial" w:hAnsi="Arial"/>
           <w:b/>
           <w:color w:val="172B40"/>
-          <w:sz w:val="20"/>
+          <w:sz w:val="19"/>
         </w:rPr>
         <w:t>Python Developer</w:t>
       </w:r>
@@ -450,7 +565,7 @@
           <w:rFonts w:ascii="Arial" w:hAnsi="Arial"/>
           <w:b w:val="0"/>
           <w:color w:val="172B40"/>
-          <w:sz w:val="20"/>
+          <w:sz w:val="19"/>
         </w:rPr>
         <w:t xml:space="preserve"> | Infotact Solution  </w:t>
       </w:r>
@@ -459,7 +574,7 @@
           <w:rFonts w:ascii="Arial" w:hAnsi="Arial"/>
           <w:b w:val="0"/>
           <w:color w:val="596878"/>
-          <w:sz w:val="20"/>
+          <w:sz w:val="19"/>
         </w:rPr>
         <w:tab/>
         <w:t>Apr 2025–Jul 2025</w:t>
@@ -478,9 +593,27 @@
           <w:rFonts w:ascii="Arial" w:hAnsi="Arial"/>
           <w:b w:val="0"/>
           <w:color w:val="172B40"/>
-          <w:sz w:val="20"/>
+          <w:sz w:val="18"/>
         </w:rPr>
-        <w:t>Built Droplify with Flask, SQLite, Beautiful Soup, and Selenium, including product-data collection, analytics, and automated price-drop alerts.</w:t>
+        <w:t>Developed Droplify, an e-commerce price-tracking application, on Flask and SQLite.</w:t>
+      </w:r>
+    </w:p>
+    <w:p>
+      <w:pPr>
+        <w:pStyle w:val="ListBullet"/>
+        <w:numPr>
+          <w:ilvl w:val="0"/>
+          <w:numId w:val="10"/>
+        </w:numPr>
+      </w:pPr>
+      <w:r>
+        <w:rPr>
+          <w:rFonts w:ascii="Arial" w:hAnsi="Arial"/>
+          <w:b w:val="0"/>
+          <w:color w:val="172B40"/>
+          <w:sz w:val="18"/>
+        </w:rPr>
+        <w:t>Added Beautiful Soup and Selenium data collection, analytics dashboards, and price-drop alerts.</w:t>
       </w:r>
     </w:p>
     <w:p>
@@ -492,7 +625,7 @@
           <w:rFonts w:ascii="Arial" w:hAnsi="Arial"/>
           <w:b/>
           <w:color w:val="172B40"/>
-          <w:sz w:val="20"/>
+          <w:sz w:val="19"/>
         </w:rPr>
         <w:t>Backend Developer &amp; Team Lead</w:t>
       </w:r>
@@ -501,7 +634,7 @@
           <w:rFonts w:ascii="Arial" w:hAnsi="Arial"/>
           <w:b w:val="0"/>
           <w:color w:val="172B40"/>
-          <w:sz w:val="20"/>
+          <w:sz w:val="19"/>
         </w:rPr>
         <w:t xml:space="preserve"> | CHARUSAT University  </w:t>
       </w:r>
@@ -510,7 +643,7 @@
           <w:rFonts w:ascii="Arial" w:hAnsi="Arial"/>
           <w:b w:val="0"/>
           <w:color w:val="596878"/>
-          <w:sz w:val="20"/>
+          <w:sz w:val="19"/>
         </w:rPr>
         <w:tab/>
         <w:t>Jun 2024–Aug 2024</w:t>
@@ -529,9 +662,45 @@
           <w:rFonts w:ascii="Arial" w:hAnsi="Arial"/>
           <w:b w:val="0"/>
           <w:color w:val="172B40"/>
-          <w:sz w:val="20"/>
+          <w:sz w:val="18"/>
         </w:rPr>
-        <w:t>Led a four-engineer backend team on Placestar: Node.js/Express APIs, MySQL schemas, JWT access controls, sprints, and reviews. Supported a live examination with 100+ students.</w:t>
+        <w:t>Led a four-engineer backend team on Placestar, supporting a live examination with 100+ students.</w:t>
+      </w:r>
+    </w:p>
+    <w:p>
+      <w:pPr>
+        <w:pStyle w:val="ListBullet"/>
+        <w:numPr>
+          <w:ilvl w:val="0"/>
+          <w:numId w:val="10"/>
+        </w:numPr>
+      </w:pPr>
+      <w:r>
+        <w:rPr>
+          <w:rFonts w:ascii="Arial" w:hAnsi="Arial"/>
+          <w:b w:val="0"/>
+          <w:color w:val="172B40"/>
+          <w:sz w:val="18"/>
+        </w:rPr>
+        <w:t>Designed Node.js/Express REST APIs, MySQL schemas, JWT auth, and role-based access controls.</w:t>
+      </w:r>
+    </w:p>
+    <w:p>
+      <w:pPr>
+        <w:pStyle w:val="ListBullet"/>
+        <w:numPr>
+          <w:ilvl w:val="0"/>
+          <w:numId w:val="10"/>
+        </w:numPr>
+      </w:pPr>
+      <w:r>
+        <w:rPr>
+          <w:rFonts w:ascii="Arial" w:hAnsi="Arial"/>
+          <w:b w:val="0"/>
+          <w:color w:val="172B40"/>
+          <w:sz w:val="18"/>
+        </w:rPr>
+        <w:t>Coordinated sprint planning, code reviews, and backend optimization.</w:t>
       </w:r>
     </w:p>
     <w:p>
@@ -543,7 +712,7 @@
           <w:rFonts w:ascii="Arial" w:hAnsi="Arial"/>
           <w:b/>
           <w:color w:val="172B40"/>
-          <w:sz w:val="19"/>
+          <w:sz w:val="18"/>
         </w:rPr>
         <w:t>PROJECTS</w:t>
       </w:r>
@@ -566,7 +735,7 @@
             <w:rFonts w:ascii="Arial" w:hAnsi="Arial"/>
             <w:b/>
             <w:color w:val="24647B"/>
-            <w:sz w:val="19"/>
+            <w:sz w:val="18"/>
             <w:u w:val="single"/>
           </w:rPr>
           <w:t>PondGuard</w:t>
@@ -577,7 +746,7 @@
           <w:rFonts w:ascii="Arial" w:hAnsi="Arial"/>
           <w:b w:val="0"/>
           <w:color w:val="172B40"/>
-          <w:sz w:val="19"/>
+          <w:sz w:val="18"/>
         </w:rPr>
         <w:t xml:space="preserve">  </w:t>
       </w:r>
@@ -586,7 +755,7 @@
           <w:rFonts w:ascii="Arial" w:hAnsi="Arial"/>
           <w:b w:val="0"/>
           <w:color w:val="596878"/>
-          <w:sz w:val="19"/>
+          <w:sz w:val="18"/>
         </w:rPr>
         <w:t>| Python · Flask · YOLO11</w:t>
       </w:r>
@@ -608,7 +777,7 @@
           <w:rFonts w:ascii="Arial" w:hAnsi="Arial"/>
           <w:b w:val="0"/>
           <w:color w:val="172B40"/>
-          <w:sz w:val="19"/>
+          <w:sz w:val="17"/>
         </w:rPr>
         <w:t>Owned bird-detection software with event capture and automated sprinkler and red-beam deterrents.</w:t>
       </w:r>
@@ -631,7 +800,7 @@
             <w:rFonts w:ascii="Arial" w:hAnsi="Arial"/>
             <w:b/>
             <w:color w:val="24647B"/>
-            <w:sz w:val="19"/>
+            <w:sz w:val="18"/>
             <w:u w:val="single"/>
           </w:rPr>
           <w:t>Placestar</w:t>
@@ -642,7 +811,7 @@
           <w:rFonts w:ascii="Arial" w:hAnsi="Arial"/>
           <w:b w:val="0"/>
           <w:color w:val="172B40"/>
-          <w:sz w:val="19"/>
+          <w:sz w:val="18"/>
         </w:rPr>
         <w:t xml:space="preserve">  </w:t>
       </w:r>
@@ -651,7 +820,7 @@
           <w:rFonts w:ascii="Arial" w:hAnsi="Arial"/>
           <w:b w:val="0"/>
           <w:color w:val="596878"/>
-          <w:sz w:val="19"/>
+          <w:sz w:val="18"/>
         </w:rPr>
         <w:t>| Node.js · Express · MySQL</w:t>
       </w:r>
@@ -673,7 +842,7 @@
           <w:rFonts w:ascii="Arial" w:hAnsi="Arial"/>
           <w:b w:val="0"/>
           <w:color w:val="172B40"/>
-          <w:sz w:val="19"/>
+          <w:sz w:val="17"/>
         </w:rPr>
         <w:t>Built placement/exam APIs with Wi-Fi restrictions and single-session controls; supported 100+ students.</w:t>
       </w:r>
@@ -696,7 +865,7 @@
             <w:rFonts w:ascii="Arial" w:hAnsi="Arial"/>
             <w:b/>
             <w:color w:val="24647B"/>
-            <w:sz w:val="19"/>
+            <w:sz w:val="18"/>
             <w:u w:val="single"/>
           </w:rPr>
           <w:t>Droplify</w:t>
@@ -707,7 +876,7 @@
           <w:rFonts w:ascii="Arial" w:hAnsi="Arial"/>
           <w:b w:val="0"/>
           <w:color w:val="172B40"/>
-          <w:sz w:val="19"/>
+          <w:sz w:val="18"/>
         </w:rPr>
         <w:t xml:space="preserve">  </w:t>
       </w:r>
@@ -716,7 +885,7 @@
           <w:rFonts w:ascii="Arial" w:hAnsi="Arial"/>
           <w:b w:val="0"/>
           <w:color w:val="596878"/>
-          <w:sz w:val="19"/>
+          <w:sz w:val="18"/>
         </w:rPr>
         <w:t>| Flask · SQLite · Selenium</w:t>
       </w:r>
@@ -738,7 +907,7 @@
           <w:rFonts w:ascii="Arial" w:hAnsi="Arial"/>
           <w:b w:val="0"/>
           <w:color w:val="172B40"/>
-          <w:sz w:val="19"/>
+          <w:sz w:val="17"/>
         </w:rPr>
         <w:t>Solo-built four-platform price tracking, analytics, and email alerts; validated 25+ product pages.</w:t>
       </w:r>
@@ -761,7 +930,7 @@
             <w:rFonts w:ascii="Arial" w:hAnsi="Arial"/>
             <w:b/>
             <w:color w:val="24647B"/>
-            <w:sz w:val="19"/>
+            <w:sz w:val="18"/>
             <w:u w:val="single"/>
           </w:rPr>
           <w:t>AMC Connect</w:t>
@@ -772,7 +941,7 @@
           <w:rFonts w:ascii="Arial" w:hAnsi="Arial"/>
           <w:b w:val="0"/>
           <w:color w:val="172B40"/>
-          <w:sz w:val="19"/>
+          <w:sz w:val="18"/>
         </w:rPr>
         <w:t xml:space="preserve">  </w:t>
       </w:r>
@@ -781,7 +950,7 @@
           <w:rFonts w:ascii="Arial" w:hAnsi="Arial"/>
           <w:b w:val="0"/>
           <w:color w:val="596878"/>
-          <w:sz w:val="19"/>
+          <w:sz w:val="18"/>
         </w:rPr>
         <w:t>| FastAPI · PyTorch · YOLO</w:t>
       </w:r>
@@ -803,7 +972,7 @@
           <w:rFonts w:ascii="Arial" w:hAnsi="Arial"/>
           <w:b w:val="0"/>
           <w:color w:val="172B40"/>
-          <w:sz w:val="19"/>
+          <w:sz w:val="17"/>
         </w:rPr>
         <w:t>Built civic-complaint APIs, GPS validation, image screening, and LLM-generated descriptions.</w:t>
       </w:r>
@@ -826,7 +995,7 @@
             <w:rFonts w:ascii="Arial" w:hAnsi="Arial"/>
             <w:b/>
             <w:color w:val="24647B"/>
-            <w:sz w:val="19"/>
+            <w:sz w:val="18"/>
             <w:u w:val="single"/>
           </w:rPr>
           <w:t>ClubSphere</w:t>
@@ -837,7 +1006,7 @@
           <w:rFonts w:ascii="Arial" w:hAnsi="Arial"/>
           <w:b w:val="0"/>
           <w:color w:val="172B40"/>
-          <w:sz w:val="19"/>
+          <w:sz w:val="18"/>
         </w:rPr>
         <w:t xml:space="preserve">  </w:t>
       </w:r>
@@ -846,7 +1015,7 @@
           <w:rFonts w:ascii="Arial" w:hAnsi="Arial"/>
           <w:b w:val="0"/>
           <w:color w:val="596878"/>
-          <w:sz w:val="19"/>
+          <w:sz w:val="18"/>
         </w:rPr>
         <w:t>| Node.js · PostgreSQL · JWT</w:t>
       </w:r>
@@ -868,7 +1037,7 @@
           <w:rFonts w:ascii="Arial" w:hAnsi="Arial"/>
           <w:b w:val="0"/>
           <w:color w:val="172B40"/>
-          <w:sz w:val="19"/>
+          <w:sz w:val="17"/>
         </w:rPr>
         <w:t>Led club-management APIs, database design, and authentication; piloted at CHARUSAT University.</w:t>
       </w:r>
@@ -891,7 +1060,7 @@
             <w:rFonts w:ascii="Arial" w:hAnsi="Arial"/>
             <w:b/>
             <w:color w:val="24647B"/>
-            <w:sz w:val="19"/>
+            <w:sz w:val="18"/>
             <w:u w:val="single"/>
           </w:rPr>
           <w:t>Worker Location Management</w:t>
@@ -902,7 +1071,7 @@
           <w:rFonts w:ascii="Arial" w:hAnsi="Arial"/>
           <w:b w:val="0"/>
           <w:color w:val="172B40"/>
-          <w:sz w:val="19"/>
+          <w:sz w:val="18"/>
         </w:rPr>
         <w:t xml:space="preserve">  </w:t>
       </w:r>
@@ -911,7 +1080,7 @@
           <w:rFonts w:ascii="Arial" w:hAnsi="Arial"/>
           <w:b w:val="0"/>
           <w:color w:val="596878"/>
-          <w:sz w:val="19"/>
+          <w:sz w:val="18"/>
         </w:rPr>
         <w:t>| ThingsBoard · Geofencing</w:t>
       </w:r>
@@ -933,7 +1102,7 @@
           <w:rFonts w:ascii="Arial" w:hAnsi="Arial"/>
           <w:b w:val="0"/>
           <w:color w:val="172B40"/>
-          <w:sz w:val="19"/>
+          <w:sz w:val="17"/>
         </w:rPr>
         <w:t>Configured zone/inactivity rules and alerts; validated monitoring behavior using RSSI signal data.</w:t>
       </w:r>
@@ -947,7 +1116,7 @@
           <w:rFonts w:ascii="Arial" w:hAnsi="Arial"/>
           <w:b/>
           <w:color w:val="172B40"/>
-          <w:sz w:val="19"/>
+          <w:sz w:val="18"/>
         </w:rPr>
         <w:t>EDUCATION</w:t>
       </w:r>
@@ -961,7 +1130,7 @@
           <w:rFonts w:ascii="Arial" w:hAnsi="Arial"/>
           <w:b/>
           <w:color w:val="172B40"/>
-          <w:sz w:val="20"/>
+          <w:sz w:val="19"/>
         </w:rPr>
         <w:t>B.E. in Computer Engineering</w:t>
       </w:r>
@@ -970,7 +1139,7 @@
           <w:rFonts w:ascii="Arial" w:hAnsi="Arial"/>
           <w:b w:val="0"/>
           <w:color w:val="172B40"/>
-          <w:sz w:val="20"/>
+          <w:sz w:val="19"/>
         </w:rPr>
         <w:t xml:space="preserve">  </w:t>
       </w:r>
@@ -979,7 +1148,7 @@
           <w:rFonts w:ascii="Arial" w:hAnsi="Arial"/>
           <w:b w:val="0"/>
           <w:color w:val="596878"/>
-          <w:sz w:val="20"/>
+          <w:sz w:val="19"/>
         </w:rPr>
         <w:tab/>
         <w:t>2023–2026</w:t>
@@ -994,7 +1163,7 @@
           <w:rFonts w:ascii="Arial" w:hAnsi="Arial"/>
           <w:b w:val="0"/>
           <w:color w:val="596878"/>
-          <w:sz w:val="19"/>
+          <w:sz w:val="17"/>
         </w:rPr>
         <w:t>CHARUSAT University, Anand | CGPA: 9.07/10</w:t>
       </w:r>
@@ -1008,7 +1177,7 @@
           <w:rFonts w:ascii="Arial" w:hAnsi="Arial"/>
           <w:b/>
           <w:color w:val="172B40"/>
-          <w:sz w:val="20"/>
+          <w:sz w:val="19"/>
         </w:rPr>
         <w:t>Diploma in Computer Engineering</w:t>
       </w:r>
@@ -1017,7 +1186,7 @@
           <w:rFonts w:ascii="Arial" w:hAnsi="Arial"/>
           <w:b w:val="0"/>
           <w:color w:val="172B40"/>
-          <w:sz w:val="20"/>
+          <w:sz w:val="19"/>
         </w:rPr>
         <w:t xml:space="preserve">  </w:t>
       </w:r>
@@ -1026,7 +1195,7 @@
           <w:rFonts w:ascii="Arial" w:hAnsi="Arial"/>
           <w:b w:val="0"/>
           <w:color w:val="596878"/>
-          <w:sz w:val="20"/>
+          <w:sz w:val="19"/>
         </w:rPr>
         <w:tab/>
         <w:t>2020–2023</w:t>
@@ -1041,14 +1210,42 @@
           <w:rFonts w:ascii="Arial" w:hAnsi="Arial"/>
           <w:b w:val="0"/>
           <w:color w:val="596878"/>
-          <w:sz w:val="19"/>
+          <w:sz w:val="17"/>
         </w:rPr>
         <w:t>A.V. Parekh Technical Institute, Rajkot | CGPA: 9.89/10 · Top 10 Merit Award</w:t>
       </w:r>
     </w:p>
+    <w:p>
+      <w:pPr>
+        <w:pStyle w:val="Heading1"/>
+      </w:pPr>
+      <w:r>
+        <w:rPr>
+          <w:rFonts w:ascii="Arial" w:hAnsi="Arial"/>
+          <w:b/>
+          <w:color w:val="172B40"/>
+          <w:sz w:val="18"/>
+        </w:rPr>
+        <w:t>AWARDS &amp; RECOGNITION</w:t>
+      </w:r>
+    </w:p>
+    <w:p>
+      <w:pPr>
+        <w:pStyle w:val="EducationBody"/>
+      </w:pPr>
+      <w:r>
+        <w:rPr>
+          <w:rFonts w:ascii="Arial" w:hAnsi="Arial"/>
+          <w:b w:val="0"/>
+          <w:color w:val="596878"/>
+          <w:sz w:val="17"/>
+        </w:rPr>
+        <w:t>Top 10 Merit Award, Diploma in Computer Engineering (A.V. Parekh Institute)  |  Indus Hackathon 2025 participant</w:t>
+      </w:r>
+    </w:p>
     <w:sectPr>
       <w:pgSz w:w="12240" w:h="15840"/>
-      <w:pgMar w:top="792" w:right="893" w:bottom="792" w:left="893" w:header="708" w:footer="708" w:gutter="0"/>
+      <w:pgMar w:top="560" w:right="860" w:bottom="560" w:left="860" w:header="708" w:footer="708" w:gutter="0"/>
       <w:cols w:space="720"/>
       <w:docGrid w:linePitch="360"/>
     </w:sectPr>
@@ -1440,14 +1637,14 @@
       <w:keepNext w:val="0"/>
       <w:keepLines/>
       <w:widowControl/>
-      <w:spacing w:line="232" w:lineRule="exact" w:before="0" w:after="40"/>
+      <w:spacing w:line="218" w:lineRule="exact" w:before="0" w:after="30"/>
       <w:jc w:val="left"/>
     </w:pPr>
     <w:rPr>
       <w:rFonts w:ascii="Arial" w:hAnsi="Arial"/>
       <w:b w:val="0"/>
       <w:color w:val="172B40"/>
-      <w:sz w:val="20"/>
+      <w:sz w:val="18"/>
     </w:rPr>
   </w:style>
   <w:style w:type="paragraph" w:styleId="Header">
@@ -1506,7 +1703,7 @@
       <w:keepNext/>
       <w:keepLines/>
       <w:widowControl/>
-      <w:spacing w:before="180" w:after="100" w:line="240" w:lineRule="exact"/>
+      <w:spacing w:before="90" w:after="50" w:line="220" w:lineRule="exact"/>
       <w:jc w:val="left"/>
       <w:outlineLvl w:val="0"/>
       <w:shd w:fill="EDF3F7"/>
@@ -1519,7 +1716,7 @@
       <w:b/>
       <w:bCs/>
       <w:color w:val="172B40"/>
-      <w:sz w:val="19"/>
+      <w:sz w:val="18"/>
       <w:szCs w:val="28"/>
     </w:rPr>
   </w:style>
@@ -1537,9 +1734,9 @@
       <w:keepLines/>
       <w:widowControl/>
       <w:tabs>
-        <w:tab w:pos="10454" w:val="right"/>
+        <w:tab w:pos="10520" w:val="right"/>
       </w:tabs>
-      <w:spacing w:before="80" w:after="40" w:line="240" w:lineRule="exact"/>
+      <w:spacing w:before="70" w:after="30" w:line="224" w:lineRule="exact"/>
       <w:jc w:val="left"/>
       <w:outlineLvl w:val="1"/>
     </w:pPr>
@@ -1548,7 +1745,7 @@
       <w:b w:val="0"/>
       <w:bCs/>
       <w:color w:val="172B40"/>
-      <w:sz w:val="20"/>
+      <w:sz w:val="19"/>
       <w:szCs w:val="26"/>
     </w:rPr>
   </w:style>
@@ -1565,7 +1762,7 @@
       <w:keepNext/>
       <w:keepLines/>
       <w:widowControl/>
-      <w:spacing w:before="80" w:after="40" w:line="240" w:lineRule="exact"/>
+      <w:spacing w:before="70" w:after="30" w:line="224" w:lineRule="exact"/>
       <w:jc w:val="left"/>
       <w:outlineLvl w:val="2"/>
     </w:pPr>
@@ -1574,7 +1771,7 @@
       <w:b w:val="0"/>
       <w:bCs/>
       <w:color w:val="172B40"/>
-      <w:sz w:val="20"/>
+      <w:sz w:val="19"/>
     </w:rPr>
   </w:style>
   <w:style w:type="paragraph" w:styleId="Heading4">
@@ -1808,7 +2005,7 @@
       <w:keepNext/>
       <w:keepLines/>
       <w:widowControl/>
-      <w:spacing w:after="80" w:line="620" w:lineRule="exact" w:before="0"/>
+      <w:spacing w:after="40" w:line="540" w:lineRule="exact" w:before="0"/>
       <w:contextualSpacing/>
       <w:jc w:val="left"/>
     </w:pPr>
@@ -1818,7 +2015,7 @@
       <w:color w:val="172B40"/>
       <w:spacing w:val="5"/>
       <w:kern w:val="28"/>
-      <w:sz w:val="56"/>
+      <w:sz w:val="48"/>
       <w:szCs w:val="52"/>
     </w:rPr>
   </w:style>
@@ -1852,7 +2049,7 @@
       <w:numPr>
         <w:ilvl w:val="1"/>
       </w:numPr>
-      <w:spacing w:line="240" w:lineRule="exact" w:before="0" w:after="120"/>
+      <w:spacing w:line="220" w:lineRule="exact" w:before="0" w:after="90"/>
       <w:jc w:val="left"/>
     </w:pPr>
     <w:rPr>
@@ -1862,7 +2059,7 @@
       <w:iCs/>
       <w:color w:val="24647B"/>
       <w:spacing w:val="15"/>
-      <w:sz w:val="19"/>
+      <w:sz w:val="18"/>
       <w:szCs w:val="24"/>
     </w:rPr>
   </w:style>
@@ -2001,7 +2198,7 @@
       <w:numPr>
         <w:numId w:val="1"/>
       </w:numPr>
-      <w:spacing w:line="232" w:lineRule="exact" w:before="0" w:after="40"/>
+      <w:spacing w:line="218" w:lineRule="exact" w:before="0" w:after="22"/>
       <w:contextualSpacing/>
       <w:jc w:val="left"/>
     </w:pPr>
@@ -2009,7 +2206,7 @@
       <w:rFonts w:ascii="Arial" w:hAnsi="Arial"/>
       <w:b w:val="0"/>
       <w:color w:val="172B40"/>
-      <w:sz w:val="20"/>
+      <w:sz w:val="18"/>
     </w:rPr>
   </w:style>
   <w:style w:type="paragraph" w:styleId="ListBullet2">
@@ -13171,14 +13368,14 @@
       <w:keepNext w:val="0"/>
       <w:keepLines/>
       <w:widowControl/>
-      <w:spacing w:line="220" w:lineRule="exact" w:before="0" w:after="20"/>
+      <w:spacing w:line="204" w:lineRule="exact" w:before="0" w:after="10"/>
       <w:jc w:val="left"/>
     </w:pPr>
     <w:rPr>
       <w:rFonts w:ascii="Arial" w:hAnsi="Arial"/>
       <w:b w:val="0"/>
       <w:color w:val="596878"/>
-      <w:sz w:val="18"/>
+      <w:sz w:val="17"/>
     </w:rPr>
   </w:style>
   <w:style w:type="paragraph" w:customStyle="1" w:styleId="SkillRow">
@@ -13187,14 +13384,14 @@
       <w:keepNext w:val="0"/>
       <w:keepLines/>
       <w:widowControl/>
-      <w:spacing w:line="228" w:lineRule="exact" w:before="0" w:after="0"/>
+      <w:spacing w:line="212" w:lineRule="exact" w:before="0" w:after="0"/>
       <w:jc w:val="left"/>
     </w:pPr>
     <w:rPr>
       <w:rFonts w:ascii="Arial" w:hAnsi="Arial"/>
       <w:b w:val="0"/>
       <w:color w:val="172B40"/>
-      <w:sz w:val="19"/>
+      <w:sz w:val="17"/>
     </w:rPr>
   </w:style>
   <w:style w:type="paragraph" w:customStyle="1" w:styleId="ProjectHeading">
@@ -13203,14 +13400,14 @@
       <w:keepNext/>
       <w:keepLines/>
       <w:widowControl/>
-      <w:spacing w:line="234" w:lineRule="exact" w:before="0" w:after="20"/>
+      <w:spacing w:line="216" w:lineRule="exact" w:before="0" w:after="10"/>
       <w:jc w:val="left"/>
     </w:pPr>
     <w:rPr>
       <w:rFonts w:ascii="Arial" w:hAnsi="Arial"/>
       <w:b w:val="0"/>
       <w:color w:val="172B40"/>
-      <w:sz w:val="19"/>
+      <w:sz w:val="18"/>
     </w:rPr>
   </w:style>
   <w:style w:type="paragraph" w:customStyle="1" w:styleId="ProjectBody">
@@ -13219,14 +13416,14 @@
       <w:keepNext w:val="0"/>
       <w:keepLines/>
       <w:widowControl/>
-      <w:spacing w:line="224" w:lineRule="exact" w:before="0" w:after="0"/>
+      <w:spacing w:line="208" w:lineRule="exact" w:before="0" w:after="0"/>
       <w:jc w:val="left"/>
     </w:pPr>
     <w:rPr>
       <w:rFonts w:ascii="Arial" w:hAnsi="Arial"/>
       <w:b w:val="0"/>
       <w:color w:val="172B40"/>
-      <w:sz w:val="19"/>
+      <w:sz w:val="17"/>
     </w:rPr>
   </w:style>
   <w:style w:type="paragraph" w:customStyle="1" w:styleId="EducationBody">
@@ -13235,14 +13432,14 @@
       <w:keepNext w:val="0"/>
       <w:keepLines/>
       <w:widowControl/>
-      <w:spacing w:line="228" w:lineRule="exact" w:before="0" w:after="20"/>
+      <w:spacing w:line="212" w:lineRule="exact" w:before="0" w:after="16"/>
       <w:jc w:val="left"/>
     </w:pPr>
     <w:rPr>
       <w:rFonts w:ascii="Arial" w:hAnsi="Arial"/>
       <w:b w:val="0"/>
       <w:color w:val="596878"/>
-      <w:sz w:val="19"/>
+      <w:sz w:val="17"/>
     </w:rPr>
   </w:style>
 </w:styles>

</xml_diff>